<commit_message>
Add DDL and Database Design excercises to CLass-Excercises
</commit_message>
<xml_diff>
--- a/week-02/Class-Excercises/Database Design Review Exercise 1.docx
+++ b/week-02/Class-Excercises/Database Design Review Exercise 1.docx
@@ -154,12 +154,6 @@
               </w:rPr>
               <w:t>Your Answer (PK)</w:t>
             </w:r>
-            <w:r>
-              <w:rPr>
-                <w:rFonts w:ascii="Times New Roman" w:hAnsi="Times New Roman" w:cs="Times New Roman"/>
-              </w:rPr>
-              <w:t>S</w:t>
-            </w:r>
           </w:p>
         </w:tc>
       </w:tr>
@@ -485,7 +479,7 @@
       <w:tblGrid>
         <w:gridCol w:w="1249"/>
         <w:gridCol w:w="2100"/>
-        <w:gridCol w:w="3835"/>
+        <w:gridCol w:w="3728"/>
       </w:tblGrid>
       <w:tr>
         <w:trPr>
@@ -648,7 +642,7 @@
               <w:rPr>
                 <w:rFonts w:ascii="Times New Roman" w:hAnsi="Times New Roman" w:cs="Times New Roman"/>
               </w:rPr>
-              <w:t>_____</w:t>
+              <w:t>____</w:t>
             </w:r>
           </w:p>
         </w:tc>
@@ -715,6 +709,7 @@
               </w:rPr>
               <w:t>____</w:t>
             </w:r>
+            <w:proofErr w:type="spellStart"/>
             <w:r>
               <w:rPr>
                 <w:rFonts w:ascii="Times New Roman" w:hAnsi="Times New Roman" w:cs="Times New Roman"/>
@@ -722,6 +717,7 @@
               </w:rPr>
               <w:t>CourseID</w:t>
             </w:r>
+            <w:proofErr w:type="spellEnd"/>
             <w:r>
               <w:rPr>
                 <w:rFonts w:ascii="Times New Roman" w:hAnsi="Times New Roman" w:cs="Times New Roman"/>
@@ -864,41 +860,6 @@
     <w:p>
       <w:pPr>
         <w:numPr>
-          <w:ilvl w:val="1"/>
-          <w:numId w:val="1"/>
-        </w:numPr>
-        <w:spacing w:before="100" w:beforeAutospacing="1" w:after="100" w:afterAutospacing="1" w:line="240" w:lineRule="auto"/>
-        <w:rPr>
-          <w:rFonts w:ascii="Times New Roman" w:eastAsia="Times New Roman" w:hAnsi="Times New Roman" w:cs="Times New Roman"/>
-          <w:color w:val="EE0000"/>
-          <w:kern w:val="0"/>
-          <w14:ligatures w14:val="none"/>
-        </w:rPr>
-      </w:pPr>
-      <w:r>
-        <w:rPr>
-          <w:rFonts w:ascii="Times New Roman" w:eastAsia="Times New Roman" w:hAnsi="Times New Roman" w:cs="Times New Roman"/>
-          <w:color w:val="EE0000"/>
-          <w:kern w:val="0"/>
-          <w14:ligatures w14:val="none"/>
-        </w:rPr>
-        <w:t xml:space="preserve">many-to-many </w:t>
-      </w:r>
-      <w:proofErr w:type="gramStart"/>
-      <w:r>
-        <w:rPr>
-          <w:rFonts w:ascii="Times New Roman" w:eastAsia="Times New Roman" w:hAnsi="Times New Roman" w:cs="Times New Roman"/>
-          <w:color w:val="EE0000"/>
-          <w:kern w:val="0"/>
-          <w14:ligatures w14:val="none"/>
-        </w:rPr>
-        <w:t>relationship</w:t>
-      </w:r>
-      <w:proofErr w:type="gramEnd"/>
-    </w:p>
-    <w:p>
-      <w:pPr>
-        <w:numPr>
           <w:ilvl w:val="0"/>
           <w:numId w:val="1"/>
         </w:numPr>
@@ -936,11 +897,8 @@
     </w:p>
     <w:p>
       <w:pPr>
-        <w:numPr>
-          <w:ilvl w:val="1"/>
-          <w:numId w:val="1"/>
-        </w:numPr>
         <w:spacing w:before="100" w:beforeAutospacing="1" w:after="100" w:afterAutospacing="1" w:line="240" w:lineRule="auto"/>
+        <w:ind w:firstLine="720"/>
         <w:rPr>
           <w:rFonts w:ascii="Times New Roman" w:eastAsia="Times New Roman" w:hAnsi="Times New Roman" w:cs="Times New Roman"/>
           <w:color w:val="EE0000"/>
@@ -955,7 +913,16 @@
           <w:kern w:val="0"/>
           <w14:ligatures w14:val="none"/>
         </w:rPr>
-        <w:t xml:space="preserve">many-to-many </w:t>
+        <w:t>many</w:t>
+      </w:r>
+      <w:r>
+        <w:rPr>
+          <w:rFonts w:ascii="Times New Roman" w:eastAsia="Times New Roman" w:hAnsi="Times New Roman" w:cs="Times New Roman"/>
+          <w:color w:val="EE0000"/>
+          <w:kern w:val="0"/>
+          <w14:ligatures w14:val="none"/>
+        </w:rPr>
+        <w:t xml:space="preserve">-to-many </w:t>
       </w:r>
       <w:proofErr w:type="gramStart"/>
       <w:r>
@@ -968,6 +935,16 @@
         <w:t>relationship</w:t>
       </w:r>
       <w:proofErr w:type="gramEnd"/>
+    </w:p>
+    <w:p>
+      <w:pPr>
+        <w:spacing w:before="100" w:beforeAutospacing="1" w:after="100" w:afterAutospacing="1" w:line="240" w:lineRule="auto"/>
+        <w:rPr>
+          <w:rFonts w:ascii="Times New Roman" w:eastAsia="Times New Roman" w:hAnsi="Times New Roman" w:cs="Times New Roman"/>
+          <w:kern w:val="0"/>
+          <w14:ligatures w14:val="none"/>
+        </w:rPr>
+      </w:pPr>
     </w:p>
     <w:p>
       <w:pPr>
@@ -997,6 +974,7 @@
           <w:sz w:val="28"/>
           <w:szCs w:val="28"/>
         </w:rPr>
+        <w:lastRenderedPageBreak/>
         <w:t>Section 4: Existence</w:t>
       </w:r>
     </w:p>
@@ -1015,7 +993,6 @@
           <w:kern w:val="0"/>
           <w14:ligatures w14:val="none"/>
         </w:rPr>
-        <w:lastRenderedPageBreak/>
         <w:t>Task 4</w:t>
       </w:r>
     </w:p>
@@ -1491,8 +1468,8 @@
       </w:tblPr>
       <w:tblGrid>
         <w:gridCol w:w="1482"/>
-        <w:gridCol w:w="2954"/>
-        <w:gridCol w:w="1275"/>
+        <w:gridCol w:w="2174"/>
+        <w:gridCol w:w="5442"/>
       </w:tblGrid>
       <w:tr>
         <w:trPr>
@@ -1650,7 +1627,33 @@
                 <w:kern w:val="0"/>
                 <w14:ligatures w14:val="none"/>
               </w:rPr>
-              <w:t>__________</w:t>
+              <w:t>__</w:t>
+            </w:r>
+            <w:r>
+              <w:rPr>
+                <w:rFonts w:ascii="Times New Roman" w:eastAsia="Times New Roman" w:hAnsi="Times New Roman" w:cs="Times New Roman"/>
+                <w:color w:val="EE0000"/>
+                <w:kern w:val="0"/>
+                <w14:ligatures w14:val="none"/>
+              </w:rPr>
+              <w:t>The primary key to identify students unique</w:t>
+            </w:r>
+            <w:r>
+              <w:rPr>
+                <w:rFonts w:ascii="Times New Roman" w:eastAsia="Times New Roman" w:hAnsi="Times New Roman" w:cs="Times New Roman"/>
+                <w:color w:val="EE0000"/>
+                <w:kern w:val="0"/>
+                <w14:ligatures w14:val="none"/>
+              </w:rPr>
+              <w:t>ly</w:t>
+            </w:r>
+            <w:r>
+              <w:rPr>
+                <w:rFonts w:ascii="Times New Roman" w:eastAsia="Times New Roman" w:hAnsi="Times New Roman" w:cs="Times New Roman"/>
+                <w:kern w:val="0"/>
+                <w14:ligatures w14:val="none"/>
+              </w:rPr>
+              <w:t>_____</w:t>
             </w:r>
           </w:p>
         </w:tc>
@@ -1714,16 +1717,27 @@
                 <w:kern w:val="0"/>
                 <w14:ligatures w14:val="none"/>
               </w:rPr>
-              <w:t>VARCHAR(45)</w:t>
-            </w:r>
-            <w:r>
-              <w:rPr>
-                <w:rFonts w:ascii="Times New Roman" w:eastAsia="Times New Roman" w:hAnsi="Times New Roman" w:cs="Times New Roman"/>
-                <w:kern w:val="0"/>
-                <w14:ligatures w14:val="none"/>
-              </w:rPr>
-              <w:t>_________</w:t>
-            </w:r>
+              <w:t>VARCHAR (</w:t>
+            </w:r>
+            <w:proofErr w:type="gramStart"/>
+            <w:r>
+              <w:rPr>
+                <w:rFonts w:ascii="Times New Roman" w:eastAsia="Times New Roman" w:hAnsi="Times New Roman" w:cs="Times New Roman"/>
+                <w:color w:val="EE0000"/>
+                <w:kern w:val="0"/>
+                <w14:ligatures w14:val="none"/>
+              </w:rPr>
+              <w:t>45)</w:t>
+            </w:r>
+            <w:r>
+              <w:rPr>
+                <w:rFonts w:ascii="Times New Roman" w:eastAsia="Times New Roman" w:hAnsi="Times New Roman" w:cs="Times New Roman"/>
+                <w:kern w:val="0"/>
+                <w14:ligatures w14:val="none"/>
+              </w:rPr>
+              <w:t>_</w:t>
+            </w:r>
+            <w:proofErr w:type="gramEnd"/>
           </w:p>
         </w:tc>
         <w:tc>
@@ -1747,7 +1761,42 @@
                 <w:kern w:val="0"/>
                 <w14:ligatures w14:val="none"/>
               </w:rPr>
-              <w:t>__________</w:t>
+              <w:t>__</w:t>
+            </w:r>
+            <w:r>
+              <w:rPr>
+                <w:rFonts w:ascii="Times New Roman" w:eastAsia="Times New Roman" w:hAnsi="Times New Roman" w:cs="Times New Roman"/>
+                <w:color w:val="EE0000"/>
+                <w:kern w:val="0"/>
+                <w14:ligatures w14:val="none"/>
+              </w:rPr>
+              <w:t xml:space="preserve">Store’s student’s first name; </w:t>
+            </w:r>
+            <w:r>
+              <w:rPr>
+                <w:rFonts w:ascii="Times New Roman" w:eastAsia="Times New Roman" w:hAnsi="Times New Roman" w:cs="Times New Roman"/>
+                <w:color w:val="EE0000"/>
+                <w:kern w:val="0"/>
+                <w14:ligatures w14:val="none"/>
+              </w:rPr>
+              <w:t>45</w:t>
+            </w:r>
+            <w:r>
+              <w:rPr>
+                <w:rFonts w:ascii="Times New Roman" w:eastAsia="Times New Roman" w:hAnsi="Times New Roman" w:cs="Times New Roman"/>
+                <w:color w:val="EE0000"/>
+                <w:kern w:val="0"/>
+                <w14:ligatures w14:val="none"/>
+              </w:rPr>
+              <w:t xml:space="preserve"> characters allowed</w:t>
+            </w:r>
+            <w:r>
+              <w:rPr>
+                <w:rFonts w:ascii="Times New Roman" w:eastAsia="Times New Roman" w:hAnsi="Times New Roman" w:cs="Times New Roman"/>
+                <w:kern w:val="0"/>
+                <w14:ligatures w14:val="none"/>
+              </w:rPr>
+              <w:t>__</w:t>
             </w:r>
           </w:p>
         </w:tc>
@@ -1819,7 +1868,7 @@
                 <w:kern w:val="0"/>
                 <w14:ligatures w14:val="none"/>
               </w:rPr>
-              <w:t>_________</w:t>
+              <w:t>____</w:t>
             </w:r>
           </w:p>
         </w:tc>
@@ -1844,7 +1893,24 @@
                 <w:kern w:val="0"/>
                 <w14:ligatures w14:val="none"/>
               </w:rPr>
-              <w:t>__________</w:t>
+              <w:t>__</w:t>
+            </w:r>
+            <w:r>
+              <w:rPr>
+                <w:rFonts w:ascii="Times New Roman" w:eastAsia="Times New Roman" w:hAnsi="Times New Roman" w:cs="Times New Roman"/>
+                <w:color w:val="EE0000"/>
+                <w:kern w:val="0"/>
+                <w14:ligatures w14:val="none"/>
+              </w:rPr>
+              <w:t>Stores Student’s DOB in YYYY-MM-DD format</w:t>
+            </w:r>
+            <w:r>
+              <w:rPr>
+                <w:rFonts w:ascii="Times New Roman" w:eastAsia="Times New Roman" w:hAnsi="Times New Roman" w:cs="Times New Roman"/>
+                <w:kern w:val="0"/>
+                <w14:ligatures w14:val="none"/>
+              </w:rPr>
+              <w:t>___</w:t>
             </w:r>
           </w:p>
         </w:tc>
@@ -1908,15 +1974,52 @@
                 <w:kern w:val="0"/>
                 <w14:ligatures w14:val="none"/>
               </w:rPr>
-              <w:t>VARCHAR(100)</w:t>
-            </w:r>
-            <w:r>
-              <w:rPr>
-                <w:rFonts w:ascii="Times New Roman" w:eastAsia="Times New Roman" w:hAnsi="Times New Roman" w:cs="Times New Roman"/>
-                <w:kern w:val="0"/>
-                <w14:ligatures w14:val="none"/>
-              </w:rPr>
-              <w:t>_________</w:t>
+              <w:t>VARCHAR</w:t>
+            </w:r>
+            <w:r>
+              <w:rPr>
+                <w:rFonts w:ascii="Times New Roman" w:eastAsia="Times New Roman" w:hAnsi="Times New Roman" w:cs="Times New Roman"/>
+                <w:color w:val="EE0000"/>
+                <w:kern w:val="0"/>
+                <w14:ligatures w14:val="none"/>
+              </w:rPr>
+              <w:t xml:space="preserve"> </w:t>
+            </w:r>
+            <w:r>
+              <w:rPr>
+                <w:rFonts w:ascii="Times New Roman" w:eastAsia="Times New Roman" w:hAnsi="Times New Roman" w:cs="Times New Roman"/>
+                <w:color w:val="EE0000"/>
+                <w:kern w:val="0"/>
+                <w14:ligatures w14:val="none"/>
+              </w:rPr>
+              <w:t>(</w:t>
+            </w:r>
+            <w:proofErr w:type="gramStart"/>
+            <w:r>
+              <w:rPr>
+                <w:rFonts w:ascii="Times New Roman" w:eastAsia="Times New Roman" w:hAnsi="Times New Roman" w:cs="Times New Roman"/>
+                <w:color w:val="EE0000"/>
+                <w:kern w:val="0"/>
+                <w14:ligatures w14:val="none"/>
+              </w:rPr>
+              <w:t>100)</w:t>
+            </w:r>
+            <w:r>
+              <w:rPr>
+                <w:rFonts w:ascii="Times New Roman" w:eastAsia="Times New Roman" w:hAnsi="Times New Roman" w:cs="Times New Roman"/>
+                <w:kern w:val="0"/>
+                <w14:ligatures w14:val="none"/>
+              </w:rPr>
+              <w:t>_</w:t>
+            </w:r>
+            <w:proofErr w:type="gramEnd"/>
+            <w:r>
+              <w:rPr>
+                <w:rFonts w:ascii="Times New Roman" w:eastAsia="Times New Roman" w:hAnsi="Times New Roman" w:cs="Times New Roman"/>
+                <w:kern w:val="0"/>
+                <w14:ligatures w14:val="none"/>
+              </w:rPr>
+              <w:t>_</w:t>
             </w:r>
           </w:p>
         </w:tc>
@@ -1941,7 +2044,24 @@
                 <w:kern w:val="0"/>
                 <w14:ligatures w14:val="none"/>
               </w:rPr>
-              <w:t>__________</w:t>
+              <w:t>__</w:t>
+            </w:r>
+            <w:r>
+              <w:rPr>
+                <w:rFonts w:ascii="Times New Roman" w:eastAsia="Times New Roman" w:hAnsi="Times New Roman" w:cs="Times New Roman"/>
+                <w:color w:val="EE0000"/>
+                <w:kern w:val="0"/>
+                <w14:ligatures w14:val="none"/>
+              </w:rPr>
+              <w:t>Stores Student’s email, 100 characters allowed</w:t>
+            </w:r>
+            <w:r>
+              <w:rPr>
+                <w:rFonts w:ascii="Times New Roman" w:eastAsia="Times New Roman" w:hAnsi="Times New Roman" w:cs="Times New Roman"/>
+                <w:kern w:val="0"/>
+                <w14:ligatures w14:val="none"/>
+              </w:rPr>
+              <w:t>_____</w:t>
             </w:r>
           </w:p>
         </w:tc>
@@ -2038,7 +2158,62 @@
           <w:kern w:val="0"/>
           <w14:ligatures w14:val="none"/>
         </w:rPr>
-        <w:t xml:space="preserve">Student name → __________ </w:t>
+        <w:lastRenderedPageBreak/>
+        <w:t>Student name → ___</w:t>
+      </w:r>
+      <w:r>
+        <w:rPr>
+          <w:rFonts w:ascii="Times New Roman" w:eastAsia="Times New Roman" w:hAnsi="Times New Roman" w:cs="Times New Roman"/>
+          <w:color w:val="EE0000"/>
+          <w:kern w:val="0"/>
+          <w14:ligatures w14:val="none"/>
+        </w:rPr>
+        <w:t>VARCHAR</w:t>
+      </w:r>
+      <w:r>
+        <w:rPr>
+          <w:rFonts w:ascii="Times New Roman" w:eastAsia="Times New Roman" w:hAnsi="Times New Roman" w:cs="Times New Roman"/>
+          <w:color w:val="EE0000"/>
+          <w:kern w:val="0"/>
+          <w14:ligatures w14:val="none"/>
+        </w:rPr>
+        <w:t xml:space="preserve"> </w:t>
+      </w:r>
+      <w:r>
+        <w:rPr>
+          <w:rFonts w:ascii="Times New Roman" w:eastAsia="Times New Roman" w:hAnsi="Times New Roman" w:cs="Times New Roman"/>
+          <w:color w:val="EE0000"/>
+          <w:kern w:val="0"/>
+          <w14:ligatures w14:val="none"/>
+        </w:rPr>
+        <w:t>(</w:t>
+      </w:r>
+      <w:proofErr w:type="gramStart"/>
+      <w:r>
+        <w:rPr>
+          <w:rFonts w:ascii="Times New Roman" w:eastAsia="Times New Roman" w:hAnsi="Times New Roman" w:cs="Times New Roman"/>
+          <w:color w:val="EE0000"/>
+          <w:kern w:val="0"/>
+          <w14:ligatures w14:val="none"/>
+        </w:rPr>
+        <w:t>100)</w:t>
+      </w:r>
+      <w:r>
+        <w:rPr>
+          <w:rFonts w:ascii="Times New Roman" w:eastAsia="Times New Roman" w:hAnsi="Times New Roman" w:cs="Times New Roman"/>
+          <w:kern w:val="0"/>
+          <w14:ligatures w14:val="none"/>
+        </w:rPr>
+        <w:t>_</w:t>
+      </w:r>
+      <w:proofErr w:type="gramEnd"/>
+      <w:r>
+        <w:rPr>
+          <w:rFonts w:ascii="Times New Roman" w:eastAsia="Times New Roman" w:hAnsi="Times New Roman" w:cs="Times New Roman"/>
+          <w:kern w:val="0"/>
+          <w14:ligatures w14:val="none"/>
+        </w:rPr>
+        <w:t xml:space="preserve">______ </w:t>
       </w:r>
     </w:p>
     <w:p>
@@ -2060,7 +2235,24 @@
           <w:kern w:val="0"/>
           <w14:ligatures w14:val="none"/>
         </w:rPr>
-        <w:t>Course description (long text) → __________</w:t>
+        <w:t>Course description (long text) → ___</w:t>
+      </w:r>
+      <w:r>
+        <w:rPr>
+          <w:rFonts w:ascii="Times New Roman" w:eastAsia="Times New Roman" w:hAnsi="Times New Roman" w:cs="Times New Roman"/>
+          <w:color w:val="EE0000"/>
+          <w:kern w:val="0"/>
+          <w14:ligatures w14:val="none"/>
+        </w:rPr>
+        <w:t>TEXT</w:t>
+      </w:r>
+      <w:r>
+        <w:rPr>
+          <w:rFonts w:ascii="Times New Roman" w:eastAsia="Times New Roman" w:hAnsi="Times New Roman" w:cs="Times New Roman"/>
+          <w:kern w:val="0"/>
+          <w14:ligatures w14:val="none"/>
+        </w:rPr>
+        <w:t>_______</w:t>
       </w:r>
     </w:p>
     <w:p>
@@ -2081,7 +2273,6 @@
           <w:sz w:val="28"/>
           <w:szCs w:val="28"/>
         </w:rPr>
-        <w:lastRenderedPageBreak/>
         <w:t>Section 8: Exact Numbers</w:t>
       </w:r>
     </w:p>
@@ -2140,7 +2331,34 @@
           <w:kern w:val="0"/>
           <w14:ligatures w14:val="none"/>
         </w:rPr>
-        <w:t>Course Credits (e.g., 3, 4) → __________</w:t>
+        <w:t>Course Credits (e.g., 3, 4) → ____</w:t>
+      </w:r>
+      <w:proofErr w:type="gramStart"/>
+      <w:r>
+        <w:rPr>
+          <w:rFonts w:ascii="Times New Roman" w:eastAsia="Times New Roman" w:hAnsi="Times New Roman" w:cs="Times New Roman"/>
+          <w:color w:val="EE0000"/>
+          <w:kern w:val="0"/>
+          <w14:ligatures w14:val="none"/>
+        </w:rPr>
+        <w:t>INT</w:t>
+      </w:r>
+      <w:r>
+        <w:rPr>
+          <w:rFonts w:ascii="Times New Roman" w:eastAsia="Times New Roman" w:hAnsi="Times New Roman" w:cs="Times New Roman"/>
+          <w:kern w:val="0"/>
+          <w14:ligatures w14:val="none"/>
+        </w:rPr>
+        <w:t>__</w:t>
+      </w:r>
+      <w:proofErr w:type="gramEnd"/>
+      <w:r>
+        <w:rPr>
+          <w:rFonts w:ascii="Times New Roman" w:eastAsia="Times New Roman" w:hAnsi="Times New Roman" w:cs="Times New Roman"/>
+          <w:kern w:val="0"/>
+          <w14:ligatures w14:val="none"/>
+        </w:rPr>
+        <w:t>____</w:t>
       </w:r>
     </w:p>
     <w:p>
@@ -2238,6 +2456,35 @@
         <w:spacing w:before="100" w:beforeAutospacing="1" w:after="100" w:afterAutospacing="1" w:line="240" w:lineRule="auto"/>
         <w:rPr>
           <w:rFonts w:ascii="Times New Roman" w:eastAsia="Times New Roman" w:hAnsi="Times New Roman" w:cs="Times New Roman"/>
+          <w:color w:val="EE0000"/>
+          <w:kern w:val="0"/>
+          <w14:ligatures w14:val="none"/>
+        </w:rPr>
+      </w:pPr>
+      <w:r>
+        <w:rPr>
+          <w:rFonts w:ascii="Times New Roman" w:eastAsia="Times New Roman" w:hAnsi="Times New Roman" w:cs="Times New Roman"/>
+          <w:color w:val="EE0000"/>
+          <w:kern w:val="0"/>
+          <w14:ligatures w14:val="none"/>
+        </w:rPr>
+        <w:t xml:space="preserve">I would use float </w:t>
+      </w:r>
+      <w:r>
+        <w:rPr>
+          <w:rFonts w:ascii="Times New Roman" w:eastAsia="Times New Roman" w:hAnsi="Times New Roman" w:cs="Times New Roman"/>
+          <w:color w:val="EE0000"/>
+          <w:kern w:val="0"/>
+          <w14:ligatures w14:val="none"/>
+        </w:rPr>
+        <w:t>or double if I needed to store very large or approximate values, such as scientific data where precision isn’t critical.</w:t>
+      </w:r>
+    </w:p>
+    <w:p>
+      <w:pPr>
+        <w:spacing w:before="100" w:beforeAutospacing="1" w:after="100" w:afterAutospacing="1" w:line="240" w:lineRule="auto"/>
+        <w:rPr>
+          <w:rFonts w:ascii="Times New Roman" w:eastAsia="Times New Roman" w:hAnsi="Times New Roman" w:cs="Times New Roman"/>
           <w:kern w:val="0"/>
           <w14:ligatures w14:val="none"/>
         </w:rPr>
@@ -2298,12 +2545,11 @@
       <w:r>
         <w:rPr>
           <w:rFonts w:ascii="Times New Roman" w:eastAsia="Times New Roman" w:hAnsi="Times New Roman" w:cs="Times New Roman"/>
-          <w:kern w:val="0"/>
-          <w14:ligatures w14:val="none"/>
-        </w:rPr>
-        <w:pict w14:anchorId="575B9BCB">
-          <v:rect id="_x0000_i1025" style="width:0;height:1.5pt" o:hralign="center" o:hrstd="t" o:hr="t" fillcolor="#a0a0a0" stroked="f"/>
-        </w:pict>
+          <w:color w:val="EE0000"/>
+          <w:kern w:val="0"/>
+          <w14:ligatures w14:val="none"/>
+        </w:rPr>
+        <w:t>Is-Enrolled; can indicate if a student is enrolled in a class</w:t>
       </w:r>
     </w:p>
     <w:p>
@@ -2322,23 +2568,30 @@
       <w:r>
         <w:rPr>
           <w:rFonts w:ascii="Times New Roman" w:eastAsia="Times New Roman" w:hAnsi="Times New Roman" w:cs="Times New Roman"/>
-          <w:kern w:val="0"/>
-          <w14:ligatures w14:val="none"/>
-        </w:rPr>
-        <w:pict w14:anchorId="707491BC">
-          <v:rect id="_x0000_i1026" style="width:0;height:1.5pt" o:hralign="center" o:hrstd="t" o:hr="t" fillcolor="#a0a0a0" stroked="f"/>
-        </w:pict>
-      </w:r>
-    </w:p>
-    <w:p>
-      <w:pPr>
-        <w:spacing w:before="100" w:beforeAutospacing="1" w:after="100" w:afterAutospacing="1" w:line="240" w:lineRule="auto"/>
-        <w:rPr>
-          <w:rFonts w:ascii="Times New Roman" w:eastAsia="Times New Roman" w:hAnsi="Times New Roman" w:cs="Times New Roman"/>
-          <w:kern w:val="0"/>
-          <w14:ligatures w14:val="none"/>
-        </w:rPr>
-      </w:pPr>
+          <w:color w:val="EE0000"/>
+          <w:kern w:val="0"/>
+          <w14:ligatures w14:val="none"/>
+        </w:rPr>
+        <w:t>Is-Passing</w:t>
+      </w:r>
+      <w:r>
+        <w:rPr>
+          <w:rFonts w:ascii="Times New Roman" w:eastAsia="Times New Roman" w:hAnsi="Times New Roman" w:cs="Times New Roman"/>
+          <w:color w:val="EE0000"/>
+          <w:kern w:val="0"/>
+          <w14:ligatures w14:val="none"/>
+        </w:rPr>
+        <w:t>; can indicate if a student is passing a class</w:t>
+      </w:r>
+      <w:r>
+        <w:rPr>
+          <w:rFonts w:ascii="Times New Roman" w:eastAsia="Times New Roman" w:hAnsi="Times New Roman" w:cs="Times New Roman"/>
+          <w:color w:val="EE0000"/>
+          <w:kern w:val="0"/>
+          <w14:ligatures w14:val="none"/>
+        </w:rPr>
+        <w:t xml:space="preserve"> </w:t>
+      </w:r>
     </w:p>
     <w:p>
       <w:pPr>
@@ -2399,23 +2652,56 @@
     </w:p>
     <w:p>
       <w:pPr>
+        <w:pStyle w:val="ListParagraph"/>
+        <w:numPr>
+          <w:ilvl w:val="0"/>
+          <w:numId w:val="8"/>
+        </w:numPr>
         <w:spacing w:before="100" w:beforeAutospacing="1" w:after="100" w:afterAutospacing="1" w:line="240" w:lineRule="auto"/>
         <w:rPr>
           <w:rFonts w:ascii="Times New Roman" w:eastAsia="Times New Roman" w:hAnsi="Times New Roman" w:cs="Times New Roman"/>
-          <w:kern w:val="0"/>
-          <w14:ligatures w14:val="none"/>
-        </w:rPr>
-      </w:pPr>
-      <w:r>
-        <w:rPr>
-          <w:rFonts w:ascii="Times New Roman" w:eastAsia="Times New Roman" w:hAnsi="Times New Roman" w:cs="Times New Roman"/>
-          <w:kern w:val="0"/>
-          <w14:ligatures w14:val="none"/>
-        </w:rPr>
-        <w:pict w14:anchorId="2D677D47">
-          <v:rect id="_x0000_i1027" style="width:0;height:1.5pt" o:hralign="center" o:hrstd="t" o:hr="t" fillcolor="#a0a0a0" stroked="f"/>
-        </w:pict>
-      </w:r>
+          <w:color w:val="EE0000"/>
+          <w:kern w:val="0"/>
+          <w14:ligatures w14:val="none"/>
+        </w:rPr>
+      </w:pPr>
+      <w:r>
+        <w:rPr>
+          <w:rFonts w:ascii="Times New Roman" w:eastAsia="Times New Roman" w:hAnsi="Times New Roman" w:cs="Times New Roman"/>
+          <w:color w:val="EE0000"/>
+          <w:kern w:val="0"/>
+          <w14:ligatures w14:val="none"/>
+        </w:rPr>
+        <w:t>Assignment</w:t>
+      </w:r>
+      <w:r>
+        <w:rPr>
+          <w:rFonts w:ascii="Times New Roman" w:eastAsia="Times New Roman" w:hAnsi="Times New Roman" w:cs="Times New Roman"/>
+          <w:color w:val="EE0000"/>
+          <w:kern w:val="0"/>
+          <w14:ligatures w14:val="none"/>
+        </w:rPr>
+        <w:t xml:space="preserve"> </w:t>
+      </w:r>
+      <w:r>
+        <w:rPr>
+          <w:rFonts w:ascii="Times New Roman" w:eastAsia="Times New Roman" w:hAnsi="Times New Roman" w:cs="Times New Roman"/>
+          <w:color w:val="EE0000"/>
+          <w:kern w:val="0"/>
+          <w14:ligatures w14:val="none"/>
+        </w:rPr>
+        <w:t>Submitted</w:t>
+      </w:r>
+    </w:p>
+    <w:p>
+      <w:pPr>
+        <w:spacing w:before="100" w:beforeAutospacing="1" w:after="100" w:afterAutospacing="1" w:line="240" w:lineRule="auto"/>
+        <w:rPr>
+          <w:rFonts w:ascii="Times New Roman" w:eastAsia="Times New Roman" w:hAnsi="Times New Roman" w:cs="Times New Roman"/>
+          <w:kern w:val="0"/>
+          <w14:ligatures w14:val="none"/>
+        </w:rPr>
+      </w:pPr>
     </w:p>
     <w:p>
       <w:pPr>
@@ -2445,6 +2731,7 @@
           <w:sz w:val="28"/>
           <w:szCs w:val="28"/>
         </w:rPr>
+        <w:lastRenderedPageBreak/>
         <w:t>Section 12: Unique Identifier</w:t>
       </w:r>
     </w:p>
@@ -2489,20 +2776,55 @@
         <w:spacing w:before="100" w:beforeAutospacing="1" w:after="100" w:afterAutospacing="1" w:line="240" w:lineRule="auto"/>
         <w:rPr>
           <w:rFonts w:ascii="Times New Roman" w:eastAsia="Times New Roman" w:hAnsi="Times New Roman" w:cs="Times New Roman"/>
-          <w:kern w:val="0"/>
-          <w14:ligatures w14:val="none"/>
-        </w:rPr>
-      </w:pPr>
-      <w:r>
-        <w:rPr>
-          <w:rFonts w:ascii="Times New Roman" w:eastAsia="Times New Roman" w:hAnsi="Times New Roman" w:cs="Times New Roman"/>
-          <w:kern w:val="0"/>
-          <w14:ligatures w14:val="none"/>
-        </w:rPr>
-        <w:lastRenderedPageBreak/>
-        <w:pict w14:anchorId="43434799">
-          <v:rect id="_x0000_i1028" style="width:0;height:1.5pt" o:hralign="center" o:hrstd="t" o:hr="t" fillcolor="#a0a0a0" stroked="f"/>
-        </w:pict>
+          <w:color w:val="EE0000"/>
+          <w:kern w:val="0"/>
+          <w14:ligatures w14:val="none"/>
+        </w:rPr>
+      </w:pPr>
+      <w:r>
+        <w:rPr>
+          <w:rFonts w:ascii="Times New Roman" w:eastAsia="Times New Roman" w:hAnsi="Times New Roman" w:cs="Times New Roman"/>
+          <w:color w:val="EE0000"/>
+          <w:kern w:val="0"/>
+          <w14:ligatures w14:val="none"/>
+        </w:rPr>
+        <w:t xml:space="preserve">The purpose of AUTO_INCREMET is to </w:t>
+      </w:r>
+      <w:r>
+        <w:rPr>
+          <w:rFonts w:ascii="Times New Roman" w:eastAsia="Times New Roman" w:hAnsi="Times New Roman" w:cs="Times New Roman"/>
+          <w:color w:val="EE0000"/>
+          <w:kern w:val="0"/>
+          <w14:ligatures w14:val="none"/>
+        </w:rPr>
+        <w:t xml:space="preserve">automatically </w:t>
+      </w:r>
+      <w:r>
+        <w:rPr>
+          <w:rFonts w:ascii="Times New Roman" w:eastAsia="Times New Roman" w:hAnsi="Times New Roman" w:cs="Times New Roman"/>
+          <w:color w:val="EE0000"/>
+          <w:kern w:val="0"/>
+          <w14:ligatures w14:val="none"/>
+        </w:rPr>
+        <w:t>generate unique identifiers</w:t>
+      </w:r>
+      <w:r>
+        <w:rPr>
+          <w:rFonts w:ascii="Times New Roman" w:eastAsia="Times New Roman" w:hAnsi="Times New Roman" w:cs="Times New Roman"/>
+          <w:color w:val="EE0000"/>
+          <w:kern w:val="0"/>
+          <w14:ligatures w14:val="none"/>
+        </w:rPr>
+        <w:t xml:space="preserve"> for a new record each time one is inserted. In this scenario, it creates a new identifier</w:t>
+      </w:r>
+      <w:r>
+        <w:rPr>
+          <w:rFonts w:ascii="Times New Roman" w:eastAsia="Times New Roman" w:hAnsi="Times New Roman" w:cs="Times New Roman"/>
+          <w:color w:val="EE0000"/>
+          <w:kern w:val="0"/>
+          <w14:ligatures w14:val="none"/>
+        </w:rPr>
+        <w:t xml:space="preserve"> for each new student, without manually creating one every time a new student enrolls.</w:t>
       </w:r>
     </w:p>
     <w:p>
@@ -2576,7 +2898,7 @@
       </w:tblPr>
       <w:tblGrid>
         <w:gridCol w:w="782"/>
-        <w:gridCol w:w="1275"/>
+        <w:gridCol w:w="5008"/>
       </w:tblGrid>
       <w:tr>
         <w:trPr>
@@ -2684,7 +3006,24 @@
                 <w:kern w:val="0"/>
                 <w14:ligatures w14:val="none"/>
               </w:rPr>
-              <w:t>__________</w:t>
+              <w:t>__</w:t>
+            </w:r>
+            <w:r>
+              <w:rPr>
+                <w:rFonts w:ascii="Times New Roman" w:eastAsia="Times New Roman" w:hAnsi="Times New Roman" w:cs="Times New Roman"/>
+                <w:color w:val="EE0000"/>
+                <w:kern w:val="0"/>
+                <w14:ligatures w14:val="none"/>
+              </w:rPr>
+              <w:t>Storing binary data like images or files</w:t>
+            </w:r>
+            <w:r>
+              <w:rPr>
+                <w:rFonts w:ascii="Times New Roman" w:eastAsia="Times New Roman" w:hAnsi="Times New Roman" w:cs="Times New Roman"/>
+                <w:kern w:val="0"/>
+                <w14:ligatures w14:val="none"/>
+              </w:rPr>
+              <w:t>________</w:t>
             </w:r>
           </w:p>
         </w:tc>
@@ -2739,7 +3078,24 @@
                 <w:kern w:val="0"/>
                 <w14:ligatures w14:val="none"/>
               </w:rPr>
-              <w:t>__________</w:t>
+              <w:t>__</w:t>
+            </w:r>
+            <w:r>
+              <w:rPr>
+                <w:rFonts w:ascii="Times New Roman" w:eastAsia="Times New Roman" w:hAnsi="Times New Roman" w:cs="Times New Roman"/>
+                <w:color w:val="EE0000"/>
+                <w:kern w:val="0"/>
+                <w14:ligatures w14:val="none"/>
+              </w:rPr>
+              <w:t>Storing structured data</w:t>
+            </w:r>
+            <w:r>
+              <w:rPr>
+                <w:rFonts w:ascii="Times New Roman" w:eastAsia="Times New Roman" w:hAnsi="Times New Roman" w:cs="Times New Roman"/>
+                <w:kern w:val="0"/>
+                <w14:ligatures w14:val="none"/>
+              </w:rPr>
+              <w:t>________</w:t>
             </w:r>
           </w:p>
         </w:tc>
@@ -2794,7 +3150,24 @@
                 <w:kern w:val="0"/>
                 <w14:ligatures w14:val="none"/>
               </w:rPr>
-              <w:t>__________</w:t>
+              <w:t>__</w:t>
+            </w:r>
+            <w:r>
+              <w:rPr>
+                <w:rFonts w:ascii="Times New Roman" w:eastAsia="Times New Roman" w:hAnsi="Times New Roman" w:cs="Times New Roman"/>
+                <w:color w:val="EE0000"/>
+                <w:kern w:val="0"/>
+                <w14:ligatures w14:val="none"/>
+              </w:rPr>
+              <w:t>Restricting field to predefined values</w:t>
+            </w:r>
+            <w:r>
+              <w:rPr>
+                <w:rFonts w:ascii="Times New Roman" w:eastAsia="Times New Roman" w:hAnsi="Times New Roman" w:cs="Times New Roman"/>
+                <w:kern w:val="0"/>
+                <w14:ligatures w14:val="none"/>
+              </w:rPr>
+              <w:t>________</w:t>
             </w:r>
           </w:p>
         </w:tc>
@@ -2881,7 +3254,7 @@
       </w:tblPr>
       <w:tblGrid>
         <w:gridCol w:w="1275"/>
-        <w:gridCol w:w="2661"/>
+        <w:gridCol w:w="8085"/>
       </w:tblGrid>
       <w:tr>
         <w:trPr>
@@ -2989,7 +3362,32 @@
                 <w:kern w:val="0"/>
                 <w14:ligatures w14:val="none"/>
               </w:rPr>
-              <w:t>______</w:t>
+              <w:t>__</w:t>
+            </w:r>
+            <w:r>
+              <w:rPr>
+                <w:rFonts w:ascii="Times New Roman" w:eastAsia="Times New Roman" w:hAnsi="Times New Roman" w:cs="Times New Roman"/>
+                <w:color w:val="EE0000"/>
+                <w:kern w:val="0"/>
+                <w14:ligatures w14:val="none"/>
+              </w:rPr>
+              <w:t>No</w:t>
+            </w:r>
+            <w:r>
+              <w:rPr>
+                <w:rFonts w:ascii="Times New Roman" w:eastAsia="Times New Roman" w:hAnsi="Times New Roman" w:cs="Times New Roman"/>
+                <w:kern w:val="0"/>
+                <w14:ligatures w14:val="none"/>
+              </w:rPr>
+              <w:t>____</w:t>
+            </w:r>
+            <w:r>
+              <w:rPr>
+                <w:rFonts w:ascii="Times New Roman" w:eastAsia="Times New Roman" w:hAnsi="Times New Roman" w:cs="Times New Roman"/>
+                <w:kern w:val="0"/>
+                <w14:ligatures w14:val="none"/>
+              </w:rPr>
+              <w:t xml:space="preserve"> (some schools require emails to communicate with students about enrollment or registering for classes)</w:t>
             </w:r>
           </w:p>
         </w:tc>
@@ -3044,7 +3442,24 @@
                 <w:kern w:val="0"/>
                 <w14:ligatures w14:val="none"/>
               </w:rPr>
-              <w:t>______</w:t>
+              <w:t>__</w:t>
+            </w:r>
+            <w:r>
+              <w:rPr>
+                <w:rFonts w:ascii="Times New Roman" w:eastAsia="Times New Roman" w:hAnsi="Times New Roman" w:cs="Times New Roman"/>
+                <w:color w:val="EE0000"/>
+                <w:kern w:val="0"/>
+                <w14:ligatures w14:val="none"/>
+              </w:rPr>
+              <w:t>Yes</w:t>
+            </w:r>
+            <w:r>
+              <w:rPr>
+                <w:rFonts w:ascii="Times New Roman" w:eastAsia="Times New Roman" w:hAnsi="Times New Roman" w:cs="Times New Roman"/>
+                <w:kern w:val="0"/>
+                <w14:ligatures w14:val="none"/>
+              </w:rPr>
+              <w:t>___</w:t>
             </w:r>
           </w:p>
         </w:tc>
@@ -3099,7 +3514,24 @@
                 <w:kern w:val="0"/>
                 <w14:ligatures w14:val="none"/>
               </w:rPr>
-              <w:t>______</w:t>
+              <w:t>__</w:t>
+            </w:r>
+            <w:r>
+              <w:rPr>
+                <w:rFonts w:ascii="Times New Roman" w:eastAsia="Times New Roman" w:hAnsi="Times New Roman" w:cs="Times New Roman"/>
+                <w:color w:val="EE0000"/>
+                <w:kern w:val="0"/>
+                <w14:ligatures w14:val="none"/>
+              </w:rPr>
+              <w:t>No</w:t>
+            </w:r>
+            <w:r>
+              <w:rPr>
+                <w:rFonts w:ascii="Times New Roman" w:eastAsia="Times New Roman" w:hAnsi="Times New Roman" w:cs="Times New Roman"/>
+                <w:kern w:val="0"/>
+                <w14:ligatures w14:val="none"/>
+              </w:rPr>
+              <w:t>____</w:t>
             </w:r>
           </w:p>
         </w:tc>
@@ -3214,6 +3646,7 @@
           <w:kern w:val="0"/>
           <w14:ligatures w14:val="none"/>
         </w:rPr>
+        <w:lastRenderedPageBreak/>
         <w:t xml:space="preserve">Courses </w:t>
       </w:r>
     </w:p>
@@ -3364,7 +3797,6 @@
           <w:kern w:val="0"/>
           <w14:ligatures w14:val="none"/>
         </w:rPr>
-        <w:lastRenderedPageBreak/>
         <w:t>Optional/mandatory relationships</w:t>
       </w:r>
     </w:p>
@@ -3397,6 +3829,53 @@
           <w:rFonts w:ascii="Times New Roman" w:hAnsi="Times New Roman" w:cs="Times New Roman"/>
         </w:rPr>
       </w:pPr>
+      <w:r>
+        <w:rPr>
+          <w:rFonts w:ascii="Times New Roman" w:hAnsi="Times New Roman" w:cs="Times New Roman"/>
+          <w:noProof/>
+        </w:rPr>
+        <w:drawing>
+          <wp:inline distT="0" distB="0" distL="0" distR="0" wp14:anchorId="5B02B2C0" wp14:editId="1B18721B">
+            <wp:extent cx="2208449" cy="2062163"/>
+            <wp:effectExtent l="0" t="0" r="1905" b="0"/>
+            <wp:docPr id="1782833135" name="Picture 1"/>
+            <wp:cNvGraphicFramePr>
+              <a:graphicFrameLocks xmlns:a="http://schemas.openxmlformats.org/drawingml/2006/main" noChangeAspect="1"/>
+            </wp:cNvGraphicFramePr>
+            <a:graphic xmlns:a="http://schemas.openxmlformats.org/drawingml/2006/main">
+              <a:graphicData uri="http://schemas.openxmlformats.org/drawingml/2006/picture">
+                <pic:pic xmlns:pic="http://schemas.openxmlformats.org/drawingml/2006/picture">
+                  <pic:nvPicPr>
+                    <pic:cNvPr id="1782833135" name="Picture 1782833135"/>
+                    <pic:cNvPicPr/>
+                  </pic:nvPicPr>
+                  <pic:blipFill>
+                    <a:blip r:embed="rId5" cstate="print">
+                      <a:extLst>
+                        <a:ext uri="{28A0092B-C50C-407E-A947-70E740481C1C}">
+                          <a14:useLocalDpi xmlns:a14="http://schemas.microsoft.com/office/drawing/2010/main" val="0"/>
+                        </a:ext>
+                      </a:extLst>
+                    </a:blip>
+                    <a:stretch>
+                      <a:fillRect/>
+                    </a:stretch>
+                  </pic:blipFill>
+                  <pic:spPr>
+                    <a:xfrm>
+                      <a:off x="0" y="0"/>
+                      <a:ext cx="2216270" cy="2069466"/>
+                    </a:xfrm>
+                    <a:prstGeom prst="rect">
+                      <a:avLst/>
+                    </a:prstGeom>
+                  </pic:spPr>
+                </pic:pic>
+              </a:graphicData>
+            </a:graphic>
+          </wp:inline>
+        </w:drawing>
+      </w:r>
     </w:p>
     <w:sectPr>
       <w:pgSz w:w="12240" w:h="15840"/>
@@ -3673,6 +4152,96 @@
     </w:lvl>
   </w:abstractNum>
   <w:abstractNum w:abstractNumId="2" w15:restartNumberingAfterBreak="0">
+    <w:nsid w:val="0D8A147D"/>
+    <w:multiLevelType w:val="hybridMultilevel"/>
+    <w:tmpl w:val="EE56F6A8"/>
+    <w:lvl w:ilvl="0" w:tplc="200012D6">
+      <w:start w:val="1"/>
+      <w:numFmt w:val="decimal"/>
+      <w:lvlText w:val="%1."/>
+      <w:lvlJc w:val="left"/>
+      <w:pPr>
+        <w:ind w:left="720" w:hanging="360"/>
+      </w:pPr>
+      <w:rPr>
+        <w:rFonts w:hint="default"/>
+        <w:color w:val="auto"/>
+      </w:rPr>
+    </w:lvl>
+    <w:lvl w:ilvl="1" w:tplc="04090019" w:tentative="1">
+      <w:start w:val="1"/>
+      <w:numFmt w:val="lowerLetter"/>
+      <w:lvlText w:val="%2."/>
+      <w:lvlJc w:val="left"/>
+      <w:pPr>
+        <w:ind w:left="1440" w:hanging="360"/>
+      </w:pPr>
+    </w:lvl>
+    <w:lvl w:ilvl="2" w:tplc="0409001B" w:tentative="1">
+      <w:start w:val="1"/>
+      <w:numFmt w:val="lowerRoman"/>
+      <w:lvlText w:val="%3."/>
+      <w:lvlJc w:val="right"/>
+      <w:pPr>
+        <w:ind w:left="2160" w:hanging="180"/>
+      </w:pPr>
+    </w:lvl>
+    <w:lvl w:ilvl="3" w:tplc="0409000F" w:tentative="1">
+      <w:start w:val="1"/>
+      <w:numFmt w:val="decimal"/>
+      <w:lvlText w:val="%4."/>
+      <w:lvlJc w:val="left"/>
+      <w:pPr>
+        <w:ind w:left="2880" w:hanging="360"/>
+      </w:pPr>
+    </w:lvl>
+    <w:lvl w:ilvl="4" w:tplc="04090019" w:tentative="1">
+      <w:start w:val="1"/>
+      <w:numFmt w:val="lowerLetter"/>
+      <w:lvlText w:val="%5."/>
+      <w:lvlJc w:val="left"/>
+      <w:pPr>
+        <w:ind w:left="3600" w:hanging="360"/>
+      </w:pPr>
+    </w:lvl>
+    <w:lvl w:ilvl="5" w:tplc="0409001B" w:tentative="1">
+      <w:start w:val="1"/>
+      <w:numFmt w:val="lowerRoman"/>
+      <w:lvlText w:val="%6."/>
+      <w:lvlJc w:val="right"/>
+      <w:pPr>
+        <w:ind w:left="4320" w:hanging="180"/>
+      </w:pPr>
+    </w:lvl>
+    <w:lvl w:ilvl="6" w:tplc="0409000F" w:tentative="1">
+      <w:start w:val="1"/>
+      <w:numFmt w:val="decimal"/>
+      <w:lvlText w:val="%7."/>
+      <w:lvlJc w:val="left"/>
+      <w:pPr>
+        <w:ind w:left="5040" w:hanging="360"/>
+      </w:pPr>
+    </w:lvl>
+    <w:lvl w:ilvl="7" w:tplc="04090019" w:tentative="1">
+      <w:start w:val="1"/>
+      <w:numFmt w:val="lowerLetter"/>
+      <w:lvlText w:val="%8."/>
+      <w:lvlJc w:val="left"/>
+      <w:pPr>
+        <w:ind w:left="5760" w:hanging="360"/>
+      </w:pPr>
+    </w:lvl>
+    <w:lvl w:ilvl="8" w:tplc="0409001B" w:tentative="1">
+      <w:start w:val="1"/>
+      <w:numFmt w:val="lowerRoman"/>
+      <w:lvlText w:val="%9."/>
+      <w:lvlJc w:val="right"/>
+      <w:pPr>
+        <w:ind w:left="6480" w:hanging="180"/>
+      </w:pPr>
+    </w:lvl>
+  </w:abstractNum>
+  <w:abstractNum w:abstractNumId="3" w15:restartNumberingAfterBreak="0">
     <w:nsid w:val="512F3ABF"/>
     <w:multiLevelType w:val="multilevel"/>
     <w:tmpl w:val="C4DE0358"/>
@@ -3821,7 +4390,7 @@
       </w:rPr>
     </w:lvl>
   </w:abstractNum>
-  <w:abstractNum w:abstractNumId="3" w15:restartNumberingAfterBreak="0">
+  <w:abstractNum w:abstractNumId="4" w15:restartNumberingAfterBreak="0">
     <w:nsid w:val="52303842"/>
     <w:multiLevelType w:val="multilevel"/>
     <w:tmpl w:val="00B67E0E"/>
@@ -3934,7 +4503,7 @@
       </w:pPr>
     </w:lvl>
   </w:abstractNum>
-  <w:abstractNum w:abstractNumId="4" w15:restartNumberingAfterBreak="0">
+  <w:abstractNum w:abstractNumId="5" w15:restartNumberingAfterBreak="0">
     <w:nsid w:val="53D72ADA"/>
     <w:multiLevelType w:val="multilevel"/>
     <w:tmpl w:val="6B3A120E"/>
@@ -4083,7 +4652,7 @@
       </w:rPr>
     </w:lvl>
   </w:abstractNum>
-  <w:abstractNum w:abstractNumId="5" w15:restartNumberingAfterBreak="0">
+  <w:abstractNum w:abstractNumId="6" w15:restartNumberingAfterBreak="0">
     <w:nsid w:val="60393901"/>
     <w:multiLevelType w:val="multilevel"/>
     <w:tmpl w:val="25B89048"/>
@@ -4232,7 +4801,7 @@
       </w:rPr>
     </w:lvl>
   </w:abstractNum>
-  <w:abstractNum w:abstractNumId="6" w15:restartNumberingAfterBreak="0">
+  <w:abstractNum w:abstractNumId="7" w15:restartNumberingAfterBreak="0">
     <w:nsid w:val="79C13F5A"/>
     <w:multiLevelType w:val="multilevel"/>
     <w:tmpl w:val="5D68F72C"/>
@@ -4382,24 +4951,27 @@
     </w:lvl>
   </w:abstractNum>
   <w:num w:numId="1" w16cid:durableId="2144806715">
-    <w:abstractNumId w:val="4"/>
+    <w:abstractNumId w:val="5"/>
   </w:num>
   <w:num w:numId="2" w16cid:durableId="990138662">
     <w:abstractNumId w:val="0"/>
   </w:num>
   <w:num w:numId="3" w16cid:durableId="249697474">
-    <w:abstractNumId w:val="6"/>
+    <w:abstractNumId w:val="7"/>
   </w:num>
   <w:num w:numId="4" w16cid:durableId="2094010787">
     <w:abstractNumId w:val="1"/>
   </w:num>
   <w:num w:numId="5" w16cid:durableId="606355071">
+    <w:abstractNumId w:val="4"/>
+  </w:num>
+  <w:num w:numId="6" w16cid:durableId="1460107373">
+    <w:abstractNumId w:val="6"/>
+  </w:num>
+  <w:num w:numId="7" w16cid:durableId="1374302852">
     <w:abstractNumId w:val="3"/>
   </w:num>
-  <w:num w:numId="6" w16cid:durableId="1460107373">
-    <w:abstractNumId w:val="5"/>
-  </w:num>
-  <w:num w:numId="7" w16cid:durableId="1374302852">
+  <w:num w:numId="8" w16cid:durableId="447042085">
     <w:abstractNumId w:val="2"/>
   </w:num>
 </w:numbering>

</xml_diff>